<commit_message>
Improve resume hyperlink fidelity and spacing
</commit_message>
<xml_diff>
--- a/src/resume_tailor/templates/template_v1.docx
+++ b/src/resume_tailor/templates/template_v1.docx
@@ -5,7 +5,8 @@
     <w:p>
       <w:pPr>
         <w:pStyle w:val="Title"/>
-        <w:spacing w:before="100" w:beforeAutospacing="1"/>
+        <w:keepNext w:val="0"/>
+        <w:spacing w:before="100" w:beforeAutospacing="1" w:after="0"/>
       </w:pPr>
       <w:r>
         <w:t>{{NAME}}</w:t>
@@ -14,7 +15,8 @@
     <w:p>
       <w:pPr>
         <w:pStyle w:val="BodyText"/>
-        <w:spacing w:before="11"/>
+        <w:keepNext w:val="0"/>
+        <w:spacing w:before="8" w:after="0"/>
         <w:ind w:left="0" w:firstLine="0"/>
         <w:jc w:val="center"/>
         <w:rPr>
@@ -32,11 +34,12 @@
     <w:p>
       <w:pPr>
         <w:pStyle w:val="Heading1"/>
-        <w:spacing w:before="246" w:after="32"/>
+        <w:spacing w:before="190" w:after="88"/>
         <w:rPr>
           <w:sz w:val="22"/>
           <w:szCs w:val="22"/>
         </w:rPr>
+        <w:keepNext/>
         <w:pBdr>
           <w:bottom w:val="single" w:sz="4" w:space="1" w:color="000000"/>
         </w:pBdr>
@@ -63,10 +66,11 @@
     </w:p>
     <w:p>
       <w:pPr>
+        <w:keepNext/>
         <w:tabs>
           <w:tab w:val="right" w:pos="11160"/>
         </w:tabs>
-        <w:spacing w:before="48"/>
+        <w:spacing w:before="35" w:after="0"/>
         <w:ind w:left="215"/>
       </w:pPr>
       <w:bookmarkStart w:id="10" w:name="TPL_EDUCATION_ENTRY"/>
@@ -92,10 +96,11 @@
     </w:p>
     <w:p>
       <w:pPr>
+        <w:keepNext/>
         <w:tabs>
           <w:tab w:val="right" w:pos="11160"/>
         </w:tabs>
-        <w:spacing w:before="34"/>
+        <w:spacing w:before="20" w:after="0"/>
         <w:ind w:left="216"/>
         <w:rPr>
           <w:rFonts w:ascii="Times New Roman" w:hAnsi="Times New Roman" w:cs="Times New Roman"/>
@@ -133,6 +138,7 @@
     <w:p>
       <w:pPr>
         <w:pStyle w:val="ListParagraph"/>
+        <w:keepNext w:val="0"/>
         <w:numPr>
           <w:ilvl w:val="0"/>
           <w:numId w:val="1"/>
@@ -140,7 +146,7 @@
         <w:tabs>
           <w:tab w:val="left" w:pos="695"/>
         </w:tabs>
-        <w:spacing w:before="53"/>
+        <w:spacing w:before="32" w:after="0"/>
         <w:ind w:left="525" w:hanging="185"/>
         <w:rPr>
           <w:rFonts w:ascii="Times New Roman" w:hAnsi="Times New Roman" w:cs="Times New Roman"/>
@@ -169,6 +175,7 @@
     <w:p>
       <w:pPr>
         <w:pStyle w:val="ListParagraph"/>
+        <w:keepNext w:val="0"/>
         <w:numPr>
           <w:ilvl w:val="0"/>
           <w:numId w:val="1"/>
@@ -176,6 +183,7 @@
         <w:tabs>
           <w:tab w:val="left" w:pos="695"/>
         </w:tabs>
+        <w:spacing w:after="0"/>
         <w:ind w:left="525" w:hanging="185"/>
         <w:rPr>
           <w:rFonts w:ascii="Arial" w:hAnsi="Arial"/>
@@ -195,9 +203,11 @@
     </w:p>
     <w:p>
       <w:pPr>
+        <w:keepNext/>
         <w:tabs>
           <w:tab w:val="left" w:pos="695"/>
         </w:tabs>
+        <w:spacing w:before="100" w:after="24"/>
         <w:rPr>
           <w:rFonts w:ascii="Arial" w:hAnsi="Arial"/>
           <w:i/>
@@ -303,7 +313,8 @@
     <w:p>
       <w:pPr>
         <w:pStyle w:val="BodyText"/>
-        <w:spacing w:before="82"/>
+        <w:keepNext w:val="0"/>
+        <w:spacing w:before="50" w:after="0"/>
         <w:ind w:left="108" w:right="113" w:firstLine="0"/>
         <w:rPr>
           <w:rFonts w:ascii="Times New Roman" w:hAnsi="Times New Roman" w:cs="Times New Roman"/>
@@ -335,6 +346,7 @@
     <w:p>
       <w:pPr>
         <w:pStyle w:val="Heading1"/>
+        <w:keepNext/>
         <w:rPr>
           <w:sz w:val="22"/>
           <w:szCs w:val="22"/>
@@ -469,10 +481,11 @@
     </w:p>
     <w:p>
       <w:pPr>
+        <w:keepNext/>
         <w:tabs>
           <w:tab w:val="right" w:pos="11160"/>
         </w:tabs>
-        <w:spacing w:before="115"/>
+        <w:spacing w:before="80" w:after="0"/>
         <w:rPr>
           <w:b/>
           <w:w w:val="90"/>
@@ -516,10 +529,11 @@
     </w:p>
     <w:p>
       <w:pPr>
+        <w:keepNext w:val="0"/>
         <w:tabs>
           <w:tab w:val="right" w:pos="11160"/>
         </w:tabs>
-        <w:spacing w:before="35"/>
+        <w:spacing w:before="20" w:after="0"/>
         <w:rPr>
           <w:rFonts w:ascii="Times New Roman" w:hAnsi="Times New Roman" w:cs="Times New Roman"/>
           <w:i/>
@@ -555,6 +569,7 @@
     <w:p>
       <w:pPr>
         <w:pStyle w:val="ListParagraph"/>
+        <w:keepNext w:val="0"/>
         <w:numPr>
           <w:ilvl w:val="0"/>
           <w:numId w:val="1"/>
@@ -562,6 +577,7 @@
         <w:tabs>
           <w:tab w:val="left" w:pos="695"/>
         </w:tabs>
+        <w:spacing w:after="0"/>
         <w:ind w:left="468" w:right="283" w:hanging="185"/>
         <w:rPr>
           <w:rFonts w:ascii="Times New Roman" w:hAnsi="Times New Roman" w:cs="Times New Roman"/>
@@ -582,10 +598,11 @@
     </w:p>
     <w:p>
       <w:pPr>
+        <w:keepNext/>
         <w:tabs>
           <w:tab w:val="right" w:pos="11160"/>
         </w:tabs>
-        <w:spacing w:before="111"/>
+        <w:spacing w:before="80" w:after="0"/>
       </w:pPr>
       <w:bookmarkStart w:id="13" w:name="TPL_EXPERIENCE_ENTRY_REPEAT"/>
       <w:r>
@@ -624,10 +641,11 @@
     </w:p>
     <w:p>
       <w:pPr>
+        <w:keepNext w:val="0"/>
         <w:tabs>
           <w:tab w:val="right" w:pos="11160"/>
         </w:tabs>
-        <w:spacing w:before="34"/>
+        <w:spacing w:before="20" w:after="0"/>
         <w:rPr>
           <w:rFonts w:ascii="Times New Roman" w:hAnsi="Times New Roman" w:cs="Times New Roman"/>
           <w:i/>
@@ -664,6 +682,7 @@
     <w:p>
       <w:pPr>
         <w:pStyle w:val="ListParagraph"/>
+        <w:keepNext w:val="0"/>
         <w:numPr>
           <w:ilvl w:val="0"/>
           <w:numId w:val="1"/>
@@ -671,6 +690,7 @@
         <w:tabs>
           <w:tab w:val="left" w:pos="695"/>
         </w:tabs>
+        <w:spacing w:after="0"/>
         <w:ind w:left="468" w:right="283" w:hanging="185"/>
         <w:rPr>
           <w:rFonts w:ascii="Times New Roman" w:hAnsi="Times New Roman" w:cs="Times New Roman"/>
@@ -693,11 +713,12 @@
     </w:p>
     <w:p>
       <w:pPr>
+        <w:keepNext/>
         <w:tabs>
           <w:tab w:val="left" w:pos="695"/>
           <w:tab w:val="left" w:pos="8773"/>
         </w:tabs>
-        <w:spacing w:before="61"/>
+        <w:spacing w:before="100" w:after="24"/>
         <w:ind w:right="283"/>
       </w:pPr>
       <w:r>
@@ -795,10 +816,11 @@
     </w:p>
     <w:p>
       <w:pPr>
+        <w:keepNext/>
         <w:tabs>
           <w:tab w:val="right" w:pos="11160"/>
         </w:tabs>
-        <w:spacing w:before="61"/>
+        <w:spacing w:before="70" w:after="0"/>
         <w:ind w:right="283"/>
         <w:rPr>
           <w:b/>
@@ -854,10 +876,11 @@
     </w:p>
     <w:p>
       <w:pPr>
+        <w:keepNext w:val="0"/>
         <w:tabs>
           <w:tab w:val="right" w:pos="11160"/>
         </w:tabs>
-        <w:spacing w:before="35"/>
+        <w:spacing w:before="20" w:after="0"/>
         <w:rPr>
           <w:rFonts w:ascii="Times New Roman" w:hAnsi="Times New Roman" w:cs="Times New Roman"/>
           <w:i/>
@@ -893,6 +916,7 @@
     <w:p>
       <w:pPr>
         <w:pStyle w:val="ListParagraph"/>
+        <w:keepNext w:val="0"/>
         <w:numPr>
           <w:ilvl w:val="0"/>
           <w:numId w:val="1"/>
@@ -900,6 +924,7 @@
         <w:tabs>
           <w:tab w:val="left" w:pos="695"/>
         </w:tabs>
+        <w:spacing w:after="0"/>
         <w:ind w:left="468" w:right="283" w:hanging="185"/>
         <w:rPr>
           <w:rFonts w:ascii="Times New Roman" w:hAnsi="Times New Roman" w:cs="Times New Roman"/>
@@ -2352,7 +2377,7 @@
     <w:uiPriority w:val="9"/>
     <w:qFormat/>
     <w:pPr>
-      <w:spacing w:before="1"/>
+      <w:spacing w:before="160" w:after="28"/>
       <w:outlineLvl w:val="0"/>
     </w:pPr>
     <w:rPr>
@@ -2425,7 +2450,7 @@
     <w:uiPriority w:val="1"/>
     <w:qFormat/>
     <w:pPr>
-      <w:spacing w:before="52"/>
+      <w:spacing w:before="22"/>
       <w:ind w:left="695" w:hanging="185"/>
     </w:pPr>
   </w:style>

</xml_diff>

<commit_message>
Fix resume contact labels and section spacing
</commit_message>
<xml_diff>
--- a/src/resume_tailor/templates/template_v1.docx
+++ b/src/resume_tailor/templates/template_v1.docx
@@ -34,14 +34,14 @@
     <w:p>
       <w:pPr>
         <w:pStyle w:val="Heading1"/>
-        <w:spacing w:before="190" w:after="88"/>
+        <w:spacing w:before="120" w:after="40"/>
         <w:rPr>
           <w:sz w:val="22"/>
           <w:szCs w:val="22"/>
         </w:rPr>
         <w:keepNext/>
         <w:pBdr>
-          <w:bottom w:val="single" w:sz="4" w:space="1" w:color="000000"/>
+          <w:top w:val="single" w:sz="4" w:space="1" w:color="auto"/>
         </w:pBdr>
       </w:pPr>
       <w:r>
@@ -207,93 +207,17 @@
         <w:tabs>
           <w:tab w:val="left" w:pos="695"/>
         </w:tabs>
-        <w:spacing w:before="100" w:after="24"/>
+        <w:spacing w:before="120" w:after="40"/>
         <w:rPr>
           <w:rFonts w:ascii="Arial" w:hAnsi="Arial"/>
           <w:i/>
           <w:position w:val="2"/>
           <w:sz w:val="12"/>
         </w:rPr>
-      </w:pPr>
-      <w:r>
-        <w:rPr>
-          <w:noProof/>
-        </w:rPr>
-        <mc:AlternateContent>
-          <mc:Choice Requires="wps">
-            <w:drawing>
-              <wp:anchor distT="0" distB="0" distL="0" distR="0" simplePos="0" relativeHeight="251658752" behindDoc="1" locked="0" layoutInCell="1" allowOverlap="1" wp14:anchorId="5C33E1F6" wp14:editId="04B8B22C">
-                <wp:simplePos x="0" y="0"/>
-                <wp:positionH relativeFrom="page">
-                  <wp:posOffset>447675</wp:posOffset>
-                </wp:positionH>
-                <wp:positionV relativeFrom="paragraph">
-                  <wp:posOffset>170815</wp:posOffset>
-                </wp:positionV>
-                <wp:extent cx="6858000" cy="1270"/>
-                <wp:effectExtent l="0" t="0" r="0" b="0"/>
-                <wp:wrapTopAndBottom/>
-                <wp:docPr id="7" name="Graphic 7"/>
-                <wp:cNvGraphicFramePr>
-                  <a:graphicFrameLocks xmlns:a="http://schemas.openxmlformats.org/drawingml/2006/main"/>
-                </wp:cNvGraphicFramePr>
-                <a:graphic xmlns:a="http://schemas.openxmlformats.org/drawingml/2006/main">
-                  <a:graphicData uri="http://schemas.microsoft.com/office/word/2010/wordprocessingShape">
-                    <wps:wsp>
-                      <wps:cNvSpPr>
-                        <a:spLocks/>
-                      </wps:cNvSpPr>
-                      <wps:spPr>
-                        <a:xfrm>
-                          <a:off x="0" y="0"/>
-                          <a:ext cx="6858000" cy="1270"/>
-                        </a:xfrm>
-                        <a:custGeom>
-                          <a:avLst/>
-                          <a:gdLst/>
-                          <a:ahLst/>
-                          <a:cxnLst/>
-                          <a:rect l="l" t="t" r="r" b="b"/>
-                          <a:pathLst>
-                            <a:path w="6858000">
-                              <a:moveTo>
-                                <a:pt x="0" y="0"/>
-                              </a:moveTo>
-                              <a:lnTo>
-                                <a:pt x="6858000" y="0"/>
-                              </a:lnTo>
-                            </a:path>
-                          </a:pathLst>
-                        </a:custGeom>
-                        <a:ln w="5054">
-                          <a:solidFill>
-                            <a:srgbClr val="000000"/>
-                          </a:solidFill>
-                          <a:prstDash val="solid"/>
-                        </a:ln>
-                      </wps:spPr>
-                      <wps:bodyPr wrap="square" lIns="0" tIns="0" rIns="0" bIns="0" rtlCol="0">
-                        <a:prstTxWarp prst="textNoShape">
-                          <a:avLst/>
-                        </a:prstTxWarp>
-                        <a:noAutofit/>
-                      </wps:bodyPr>
-                    </wps:wsp>
-                  </a:graphicData>
-                </a:graphic>
-              </wp:anchor>
-            </w:drawing>
-          </mc:Choice>
-          <mc:Fallback>
-            <w:pict>
-              <v:shape w14:anchorId="7C8AB30B" id="Graphic 7" o:spid="_x0000_s1026" style="position:absolute;margin-left:35.25pt;margin-top:13.45pt;width:540pt;height:.1pt;z-index:-251657728;visibility:visible;mso-wrap-style:square;mso-wrap-distance-left:0;mso-wrap-distance-top:0;mso-wrap-distance-right:0;mso-wrap-distance-bottom:0;mso-position-horizontal:absolute;mso-position-horizontal-relative:page;mso-position-vertical:absolute;mso-position-vertical-relative:text;v-text-anchor:top" coordsize="6858000,1270" o:gfxdata="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" path="m,l6858000,e" filled="f" strokeweight=".14039mm">
-                <v:path arrowok="t"/>
-                <w10:wrap type="topAndBottom" anchorx="page"/>
-              </v:shape>
-            </w:pict>
-          </mc:Fallback>
-        </mc:AlternateContent>
-      </w:r>
+        <w:pBdr>
+          <w:top w:val="single" w:sz="4" w:space="1" w:color="auto"/>
+        </w:pBdr>
+      </w:pPr>
       <w:r>
         <w:rPr>
           <w:spacing w:val="-2"/>
@@ -347,92 +271,15 @@
       <w:pPr>
         <w:pStyle w:val="Heading1"/>
         <w:keepNext/>
+        <w:spacing w:before="120" w:after="40"/>
         <w:rPr>
           <w:sz w:val="22"/>
           <w:szCs w:val="22"/>
         </w:rPr>
-      </w:pPr>
-      <w:r>
-        <w:rPr>
-          <w:noProof/>
-          <w:sz w:val="22"/>
-          <w:szCs w:val="22"/>
-        </w:rPr>
-        <mc:AlternateContent>
-          <mc:Choice Requires="wps">
-            <w:drawing>
-              <wp:anchor distT="0" distB="0" distL="0" distR="0" simplePos="0" relativeHeight="251655680" behindDoc="1" locked="0" layoutInCell="1" allowOverlap="1" wp14:anchorId="31B0EB2F" wp14:editId="6B3B35D3">
-                <wp:simplePos x="0" y="0"/>
-                <wp:positionH relativeFrom="page">
-                  <wp:posOffset>457200</wp:posOffset>
-                </wp:positionH>
-                <wp:positionV relativeFrom="paragraph">
-                  <wp:posOffset>199895</wp:posOffset>
-                </wp:positionV>
-                <wp:extent cx="6858000" cy="1270"/>
-                <wp:effectExtent l="0" t="0" r="0" b="0"/>
-                <wp:wrapTopAndBottom/>
-                <wp:docPr id="8" name="Graphic 8"/>
-                <wp:cNvGraphicFramePr>
-                  <a:graphicFrameLocks xmlns:a="http://schemas.openxmlformats.org/drawingml/2006/main"/>
-                </wp:cNvGraphicFramePr>
-                <a:graphic xmlns:a="http://schemas.openxmlformats.org/drawingml/2006/main">
-                  <a:graphicData uri="http://schemas.microsoft.com/office/word/2010/wordprocessingShape">
-                    <wps:wsp>
-                      <wps:cNvSpPr>
-                        <a:spLocks/>
-                      </wps:cNvSpPr>
-                      <wps:spPr>
-                        <a:xfrm>
-                          <a:off x="0" y="0"/>
-                          <a:ext cx="6858000" cy="1270"/>
-                        </a:xfrm>
-                        <a:custGeom>
-                          <a:avLst/>
-                          <a:gdLst/>
-                          <a:ahLst/>
-                          <a:cxnLst/>
-                          <a:rect l="l" t="t" r="r" b="b"/>
-                          <a:pathLst>
-                            <a:path w="6858000">
-                              <a:moveTo>
-                                <a:pt x="0" y="0"/>
-                              </a:moveTo>
-                              <a:lnTo>
-                                <a:pt x="6858000" y="0"/>
-                              </a:lnTo>
-                            </a:path>
-                          </a:pathLst>
-                        </a:custGeom>
-                        <a:ln w="5054">
-                          <a:solidFill>
-                            <a:srgbClr val="000000"/>
-                          </a:solidFill>
-                          <a:prstDash val="solid"/>
-                        </a:ln>
-                      </wps:spPr>
-                      <wps:bodyPr wrap="square" lIns="0" tIns="0" rIns="0" bIns="0" rtlCol="0">
-                        <a:prstTxWarp prst="textNoShape">
-                          <a:avLst/>
-                        </a:prstTxWarp>
-                        <a:noAutofit/>
-                      </wps:bodyPr>
-                    </wps:wsp>
-                  </a:graphicData>
-                </a:graphic>
-              </wp:anchor>
-            </w:drawing>
-          </mc:Choice>
-          <mc:Fallback>
-            <w:pict>
-              <v:shape w14:anchorId="63FA5DD6" id="Graphic 8" o:spid="_x0000_s1026" style="position:absolute;margin-left:36pt;margin-top:15.75pt;width:540pt;height:.1pt;z-index:-251660800;visibility:visible;mso-wrap-style:square;mso-wrap-distance-left:0;mso-wrap-distance-top:0;mso-wrap-distance-right:0;mso-wrap-distance-bottom:0;mso-position-horizontal:absolute;mso-position-horizontal-relative:page;mso-position-vertical:absolute;mso-position-vertical-relative:text;v-text-anchor:top" coordsize="6858000,1270" o:gfxdata="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" path="m,l6858000,e" filled="f" strokeweight=".14039mm">
-                <v:path arrowok="t"/>
-                <w10:wrap type="topAndBottom" anchorx="page"/>
-              </v:shape>
-            </w:pict>
-          </mc:Fallback>
-        </mc:AlternateContent>
-      </w:r>
+        <w:pBdr>
+          <w:top w:val="single" w:sz="4" w:space="1" w:color="auto"/>
+        </w:pBdr>
+      </w:pPr>
       <w:r>
         <w:rPr>
           <w:w w:val="105"/>
@@ -718,88 +565,12 @@
           <w:tab w:val="left" w:pos="695"/>
           <w:tab w:val="left" w:pos="8773"/>
         </w:tabs>
-        <w:spacing w:before="100" w:after="24"/>
+        <w:spacing w:before="120" w:after="40"/>
         <w:ind w:right="283"/>
-      </w:pPr>
-      <w:r>
-        <w:rPr>
-          <w:noProof/>
-        </w:rPr>
-        <mc:AlternateContent>
-          <mc:Choice Requires="wps">
-            <w:drawing>
-              <wp:anchor distT="0" distB="0" distL="0" distR="0" simplePos="0" relativeHeight="251659264" behindDoc="1" locked="0" layoutInCell="1" allowOverlap="1" wp14:anchorId="598CD1FE" wp14:editId="24041C57">
-                <wp:simplePos x="0" y="0"/>
-                <wp:positionH relativeFrom="page">
-                  <wp:posOffset>457200</wp:posOffset>
-                </wp:positionH>
-                <wp:positionV relativeFrom="paragraph">
-                  <wp:posOffset>223520</wp:posOffset>
-                </wp:positionV>
-                <wp:extent cx="6858000" cy="1270"/>
-                <wp:effectExtent l="0" t="0" r="0" b="0"/>
-                <wp:wrapTopAndBottom/>
-                <wp:docPr id="9" name="Graphic 9"/>
-                <wp:cNvGraphicFramePr>
-                  <a:graphicFrameLocks xmlns:a="http://schemas.openxmlformats.org/drawingml/2006/main"/>
-                </wp:cNvGraphicFramePr>
-                <a:graphic xmlns:a="http://schemas.openxmlformats.org/drawingml/2006/main">
-                  <a:graphicData uri="http://schemas.microsoft.com/office/word/2010/wordprocessingShape">
-                    <wps:wsp>
-                      <wps:cNvSpPr>
-                        <a:spLocks/>
-                      </wps:cNvSpPr>
-                      <wps:spPr>
-                        <a:xfrm>
-                          <a:off x="0" y="0"/>
-                          <a:ext cx="6858000" cy="1270"/>
-                        </a:xfrm>
-                        <a:custGeom>
-                          <a:avLst/>
-                          <a:gdLst/>
-                          <a:ahLst/>
-                          <a:cxnLst/>
-                          <a:rect l="l" t="t" r="r" b="b"/>
-                          <a:pathLst>
-                            <a:path w="6858000">
-                              <a:moveTo>
-                                <a:pt x="0" y="0"/>
-                              </a:moveTo>
-                              <a:lnTo>
-                                <a:pt x="6858000" y="0"/>
-                              </a:lnTo>
-                            </a:path>
-                          </a:pathLst>
-                        </a:custGeom>
-                        <a:ln w="5054">
-                          <a:solidFill>
-                            <a:srgbClr val="000000"/>
-                          </a:solidFill>
-                          <a:prstDash val="solid"/>
-                        </a:ln>
-                      </wps:spPr>
-                      <wps:bodyPr wrap="square" lIns="0" tIns="0" rIns="0" bIns="0" rtlCol="0">
-                        <a:prstTxWarp prst="textNoShape">
-                          <a:avLst/>
-                        </a:prstTxWarp>
-                        <a:noAutofit/>
-                      </wps:bodyPr>
-                    </wps:wsp>
-                  </a:graphicData>
-                </a:graphic>
-              </wp:anchor>
-            </w:drawing>
-          </mc:Choice>
-          <mc:Fallback>
-            <w:pict>
-              <v:shape w14:anchorId="109C5DAC" id="Graphic 9" o:spid="_x0000_s1026" style="position:absolute;margin-left:36pt;margin-top:17.6pt;width:540pt;height:.1pt;z-index:-251657216;visibility:visible;mso-wrap-style:square;mso-wrap-distance-left:0;mso-wrap-distance-top:0;mso-wrap-distance-right:0;mso-wrap-distance-bottom:0;mso-position-horizontal:absolute;mso-position-horizontal-relative:page;mso-position-vertical:absolute;mso-position-vertical-relative:text;v-text-anchor:top" coordsize="6858000,1270" o:gfxdata="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" path="m,l6858000,e" filled="f" strokeweight=".14039mm">
-                <v:path arrowok="t"/>
-                <w10:wrap type="topAndBottom" anchorx="page"/>
-              </v:shape>
-            </w:pict>
-          </mc:Fallback>
-        </mc:AlternateContent>
-      </w:r>
+        <w:pBdr>
+          <w:top w:val="single" w:sz="4" w:space="1" w:color="auto"/>
+        </w:pBdr>
+      </w:pPr>
       <w:r>
         <w:rPr>
           <w:spacing w:val="-2"/>

</xml_diff>